<commit_message>
Ajout de la bibli font awesome
mise en place des icones dans chaque vue pour les buttons delete,edit,create et details
</commit_message>
<xml_diff>
--- a/S10_Lab1_Instructions.docx
+++ b/S10_Lab1_Instructions.docx
@@ -1889,7 +1889,15 @@
               <w:ind w:left="288"/>
             </w:pPr>
             <w:r>
-              <w:t>Back to list : left arrow</w:t>
+              <w:t xml:space="preserve">Back to </w:t>
+            </w:r>
+            <w:proofErr w:type="gramStart"/>
+            <w:r>
+              <w:t>list :</w:t>
+            </w:r>
+            <w:proofErr w:type="gramEnd"/>
+            <w:r>
+              <w:t xml:space="preserve"> left arrow</w:t>
             </w:r>
           </w:p>
         </w:tc>
@@ -2022,7 +2030,15 @@
               <w:ind w:left="288"/>
             </w:pPr>
             <w:r>
-              <w:t>New/Create : plus</w:t>
+              <w:t>New/</w:t>
+            </w:r>
+            <w:proofErr w:type="gramStart"/>
+            <w:r>
+              <w:t>Create :</w:t>
+            </w:r>
+            <w:proofErr w:type="gramEnd"/>
+            <w:r>
+              <w:t xml:space="preserve"> plus</w:t>
             </w:r>
           </w:p>
         </w:tc>
@@ -2035,6 +2051,60 @@
               <w:spacing w:after="160" w:line="259" w:lineRule="auto"/>
               <w:ind w:left="3"/>
             </w:pPr>
+            <w:r>
+              <w:rPr>
+                <w:rFonts w:ascii="Cascadia Mono" w:hAnsi="Cascadia Mono" w:cs="Cascadia Mono"/>
+                <w:color w:val="000000" w:themeColor="text1"/>
+                <w:sz w:val="19"/>
+                <w:szCs w:val="19"/>
+                <w14:ligatures w14:val="standardContextual"/>
+              </w:rPr>
+              <w:t>&lt;</w:t>
+            </w:r>
+            <w:proofErr w:type="spellStart"/>
+            <w:r>
+              <w:rPr>
+                <w:rFonts w:ascii="Cascadia Mono" w:hAnsi="Cascadia Mono" w:cs="Cascadia Mono"/>
+                <w:color w:val="000000" w:themeColor="text1"/>
+                <w:sz w:val="19"/>
+                <w:szCs w:val="19"/>
+                <w14:ligatures w14:val="standardContextual"/>
+              </w:rPr>
+              <w:t>i</w:t>
+            </w:r>
+            <w:proofErr w:type="spellEnd"/>
+            <w:r>
+              <w:rPr>
+                <w:rFonts w:ascii="Cascadia Mono" w:hAnsi="Cascadia Mono" w:cs="Cascadia Mono"/>
+                <w:color w:val="000000" w:themeColor="text1"/>
+                <w:sz w:val="19"/>
+                <w:szCs w:val="19"/>
+                <w14:ligatures w14:val="standardContextual"/>
+              </w:rPr>
+              <w:t xml:space="preserve"> class="fa-solid fa-plus"&gt;&lt;/</w:t>
+            </w:r>
+            <w:proofErr w:type="spellStart"/>
+            <w:r>
+              <w:rPr>
+                <w:rFonts w:ascii="Cascadia Mono" w:hAnsi="Cascadia Mono" w:cs="Cascadia Mono"/>
+                <w:color w:val="000000" w:themeColor="text1"/>
+                <w:sz w:val="19"/>
+                <w:szCs w:val="19"/>
+                <w14:ligatures w14:val="standardContextual"/>
+              </w:rPr>
+              <w:t>i</w:t>
+            </w:r>
+            <w:proofErr w:type="spellEnd"/>
+            <w:r>
+              <w:rPr>
+                <w:rFonts w:ascii="Cascadia Mono" w:hAnsi="Cascadia Mono" w:cs="Cascadia Mono"/>
+                <w:color w:val="000000" w:themeColor="text1"/>
+                <w:sz w:val="19"/>
+                <w:szCs w:val="19"/>
+                <w14:ligatures w14:val="standardContextual"/>
+              </w:rPr>
+              <w:t>&gt;</w:t>
+            </w:r>
           </w:p>
         </w:tc>
       </w:tr>
@@ -2049,7 +2119,15 @@
               <w:ind w:left="288"/>
             </w:pPr>
             <w:r>
-              <w:t>Edit/Update : Edit</w:t>
+              <w:t>Edit/</w:t>
+            </w:r>
+            <w:proofErr w:type="gramStart"/>
+            <w:r>
+              <w:t>Update :</w:t>
+            </w:r>
+            <w:proofErr w:type="gramEnd"/>
+            <w:r>
+              <w:t xml:space="preserve"> Edit</w:t>
             </w:r>
           </w:p>
         </w:tc>
@@ -2062,6 +2140,25 @@
               <w:spacing w:after="160" w:line="259" w:lineRule="auto"/>
               <w:ind w:left="3"/>
             </w:pPr>
+            <w:r>
+              <w:t>&lt;</w:t>
+            </w:r>
+            <w:proofErr w:type="spellStart"/>
+            <w:r>
+              <w:t>i</w:t>
+            </w:r>
+            <w:proofErr w:type="spellEnd"/>
+            <w:r>
+              <w:t xml:space="preserve"> class="fa-solid fa-pen-to-square"&gt;&lt;/</w:t>
+            </w:r>
+            <w:proofErr w:type="spellStart"/>
+            <w:r>
+              <w:t>i</w:t>
+            </w:r>
+            <w:proofErr w:type="spellEnd"/>
+            <w:r>
+              <w:t>&gt;</w:t>
+            </w:r>
           </w:p>
         </w:tc>
       </w:tr>
@@ -2075,8 +2172,13 @@
               <w:spacing w:after="160" w:line="259" w:lineRule="auto"/>
               <w:ind w:left="288"/>
             </w:pPr>
+            <w:proofErr w:type="gramStart"/>
             <w:r>
-              <w:t>Delete : Delete trash</w:t>
+              <w:t>Delete :</w:t>
+            </w:r>
+            <w:proofErr w:type="gramEnd"/>
+            <w:r>
+              <w:t xml:space="preserve"> Delete trash</w:t>
             </w:r>
           </w:p>
         </w:tc>
@@ -2089,6 +2191,25 @@
               <w:spacing w:after="160" w:line="259" w:lineRule="auto"/>
               <w:ind w:left="3"/>
             </w:pPr>
+            <w:r>
+              <w:t>&lt;</w:t>
+            </w:r>
+            <w:proofErr w:type="spellStart"/>
+            <w:r>
+              <w:t>i</w:t>
+            </w:r>
+            <w:proofErr w:type="spellEnd"/>
+            <w:r>
+              <w:t xml:space="preserve"> class="fa-solid fa-trash"&gt;&lt;/</w:t>
+            </w:r>
+            <w:proofErr w:type="spellStart"/>
+            <w:r>
+              <w:t>i</w:t>
+            </w:r>
+            <w:proofErr w:type="spellEnd"/>
+            <w:r>
+              <w:t>&gt;</w:t>
+            </w:r>
           </w:p>
         </w:tc>
       </w:tr>
@@ -2102,8 +2223,13 @@
               <w:spacing w:after="160" w:line="259" w:lineRule="auto"/>
               <w:ind w:left="288"/>
             </w:pPr>
+            <w:proofErr w:type="gramStart"/>
             <w:r>
-              <w:t xml:space="preserve">Details : </w:t>
+              <w:t>Details :</w:t>
+            </w:r>
+            <w:proofErr w:type="gramEnd"/>
+            <w:r>
+              <w:t xml:space="preserve"> </w:t>
             </w:r>
           </w:p>
         </w:tc>
@@ -2116,6 +2242,25 @@
               <w:spacing w:after="160" w:line="259" w:lineRule="auto"/>
               <w:ind w:left="3"/>
             </w:pPr>
+            <w:r>
+              <w:t>&lt;</w:t>
+            </w:r>
+            <w:proofErr w:type="spellStart"/>
+            <w:r>
+              <w:t>i</w:t>
+            </w:r>
+            <w:proofErr w:type="spellEnd"/>
+            <w:r>
+              <w:t xml:space="preserve"> class="fa-solid fa-circle-info"&gt;&lt;/</w:t>
+            </w:r>
+            <w:proofErr w:type="spellStart"/>
+            <w:r>
+              <w:t>i</w:t>
+            </w:r>
+            <w:proofErr w:type="spellEnd"/>
+            <w:r>
+              <w:t>&gt;</w:t>
+            </w:r>
           </w:p>
         </w:tc>
       </w:tr>
@@ -2204,6 +2349,7 @@
           <w:lang w:val="en-US"/>
         </w:rPr>
       </w:pPr>
+      <w:proofErr w:type="gramStart"/>
       <w:r>
         <w:rPr>
           <w:lang w:val="en-US"/>
@@ -2222,6 +2368,7 @@
         </w:rPr>
         <w:t> :</w:t>
       </w:r>
+      <w:proofErr w:type="gramEnd"/>
     </w:p>
     <w:p>
       <w:pPr>
@@ -2808,6 +2955,7 @@
         <w:t>&amp;</w:t>
       </w:r>
       <w:proofErr w:type="spellStart"/>
+      <w:proofErr w:type="gramStart"/>
       <w:r>
         <w:rPr>
           <w:rFonts w:ascii="Cascadia Mono" w:hAnsi="Cascadia Mono" w:cs="Cascadia Mono"/>
@@ -2830,6 +2978,7 @@
         <w:t>Create</w:t>
       </w:r>
       <w:proofErr w:type="spellEnd"/>
+      <w:proofErr w:type="gramEnd"/>
       <w:r>
         <w:rPr>
           <w:rFonts w:ascii="Cascadia Mono" w:hAnsi="Cascadia Mono" w:cs="Cascadia Mono"/>
@@ -3389,6 +3538,7 @@
         <w:t>&amp;</w:t>
       </w:r>
       <w:proofErr w:type="spellStart"/>
+      <w:proofErr w:type="gramStart"/>
       <w:r>
         <w:rPr>
           <w:rFonts w:ascii="Cascadia Mono" w:hAnsi="Cascadia Mono" w:cs="Cascadia Mono"/>
@@ -3411,6 +3561,7 @@
         <w:t>Create</w:t>
       </w:r>
       <w:proofErr w:type="spellEnd"/>
+      <w:proofErr w:type="gramEnd"/>
       <w:r>
         <w:rPr>
           <w:rFonts w:ascii="Cascadia Mono" w:hAnsi="Cascadia Mono" w:cs="Cascadia Mono"/>
@@ -3601,9 +3752,32 @@
           <w:szCs w:val="19"/>
           <w:lang w:val="en-CA"/>
         </w:rPr>
-        <w:t xml:space="preserve"> { id=</w:t>
+        <w:t xml:space="preserve"> </w:t>
+      </w:r>
+      <w:proofErr w:type="gramStart"/>
+      <w:r>
+        <w:rPr>
+          <w:rFonts w:ascii="Cascadia Mono" w:hAnsi="Cascadia Mono" w:cs="Cascadia Mono"/>
+          <w:color w:val="000000"/>
+          <w:sz w:val="19"/>
+          <w:szCs w:val="19"/>
+          <w:lang w:val="en-CA"/>
+        </w:rPr>
+        <w:t>{ id</w:t>
+      </w:r>
+      <w:proofErr w:type="gramEnd"/>
+      <w:r>
+        <w:rPr>
+          <w:rFonts w:ascii="Cascadia Mono" w:hAnsi="Cascadia Mono" w:cs="Cascadia Mono"/>
+          <w:color w:val="000000"/>
+          <w:sz w:val="19"/>
+          <w:szCs w:val="19"/>
+          <w:lang w:val="en-CA"/>
+        </w:rPr>
+        <w:t>=</w:t>
       </w:r>
       <w:proofErr w:type="spellStart"/>
+      <w:proofErr w:type="gramStart"/>
       <w:r>
         <w:rPr>
           <w:rFonts w:ascii="Cascadia Mono" w:hAnsi="Cascadia Mono" w:cs="Cascadia Mono"/>
@@ -3615,6 +3789,7 @@
         <w:t>item.WeaponId</w:t>
       </w:r>
       <w:proofErr w:type="spellEnd"/>
+      <w:proofErr w:type="gramEnd"/>
       <w:r>
         <w:rPr>
           <w:rFonts w:ascii="Cascadia Mono" w:hAnsi="Cascadia Mono" w:cs="Cascadia Mono"/>
@@ -3681,6 +3856,7 @@
         </w:rPr>
         <w:t>&lt;</w:t>
       </w:r>
+      <w:proofErr w:type="gramStart"/>
       <w:r>
         <w:rPr>
           <w:rFonts w:ascii="Cascadia Mono" w:hAnsi="Cascadia Mono" w:cs="Cascadia Mono"/>
@@ -3691,6 +3867,7 @@
         </w:rPr>
         <w:t>a</w:t>
       </w:r>
+      <w:proofErr w:type="gramEnd"/>
       <w:r>
         <w:rPr>
           <w:rFonts w:ascii="Cascadia Mono" w:hAnsi="Cascadia Mono" w:cs="Cascadia Mono"/>
@@ -3784,6 +3961,7 @@
         <w:t>"@</w:t>
       </w:r>
       <w:proofErr w:type="spellStart"/>
+      <w:proofErr w:type="gramStart"/>
       <w:r>
         <w:rPr>
           <w:rFonts w:ascii="Cascadia Mono" w:hAnsi="Cascadia Mono" w:cs="Cascadia Mono"/>
@@ -3795,6 +3973,7 @@
         <w:t>item.WeaponId</w:t>
       </w:r>
       <w:proofErr w:type="spellEnd"/>
+      <w:proofErr w:type="gramEnd"/>
       <w:r>
         <w:rPr>
           <w:rFonts w:ascii="Cascadia Mono" w:hAnsi="Cascadia Mono" w:cs="Cascadia Mono"/>
@@ -3900,6 +4079,7 @@
         <w:t xml:space="preserve"> &amp;</w:t>
       </w:r>
       <w:proofErr w:type="spellStart"/>
+      <w:proofErr w:type="gramStart"/>
       <w:r>
         <w:rPr>
           <w:rFonts w:ascii="Cascadia Mono" w:hAnsi="Cascadia Mono" w:cs="Cascadia Mono"/>
@@ -3911,6 +4091,7 @@
         <w:t>nbsp;Edit</w:t>
       </w:r>
       <w:proofErr w:type="spellEnd"/>
+      <w:proofErr w:type="gramEnd"/>
       <w:r>
         <w:rPr>
           <w:rFonts w:ascii="Cascadia Mono" w:hAnsi="Cascadia Mono" w:cs="Cascadia Mono"/>
@@ -3973,7 +4154,13 @@
         <w:spacing w:before="0" w:after="160" w:line="259" w:lineRule="auto"/>
       </w:pPr>
       <w:r>
-        <w:t>Testez chaque vue.</w:t>
+        <w:rPr>
+          <w:highlight w:val="yellow"/>
+        </w:rPr>
+        <w:t>Testez chaque vue</w:t>
+      </w:r>
+      <w:r>
+        <w:t>.</w:t>
       </w:r>
     </w:p>
     <w:p>
@@ -4105,7 +4292,23 @@
           <w:b/>
           <w:bCs/>
         </w:rPr>
-        <w:t xml:space="preserve"> Card </w:t>
+        <w:t xml:space="preserve"> </w:t>
+      </w:r>
+      <w:proofErr w:type="spellStart"/>
+      <w:r>
+        <w:rPr>
+          <w:b/>
+          <w:bCs/>
+        </w:rPr>
+        <w:t>Card</w:t>
+      </w:r>
+      <w:proofErr w:type="spellEnd"/>
+      <w:r>
+        <w:rPr>
+          <w:b/>
+          <w:bCs/>
+        </w:rPr>
+        <w:t xml:space="preserve"> </w:t>
       </w:r>
       <w:r>
         <w:t xml:space="preserve">qui </w:t>
@@ -4592,6 +4795,7 @@
         <w:t>&gt;&amp;</w:t>
       </w:r>
       <w:proofErr w:type="spellStart"/>
+      <w:proofErr w:type="gramStart"/>
       <w:r>
         <w:rPr>
           <w:rFonts w:ascii="Cascadia Mono" w:hAnsi="Cascadia Mono" w:cs="Cascadia Mono"/>
@@ -4603,6 +4807,7 @@
         <w:t>nbsp;Edit</w:t>
       </w:r>
       <w:proofErr w:type="spellEnd"/>
+      <w:proofErr w:type="gramEnd"/>
     </w:p>
     <w:p>
       <w:pPr>
@@ -4641,7 +4846,7 @@
           <w:noProof/>
         </w:rPr>
         <w:drawing>
-          <wp:anchor distT="0" distB="0" distL="114300" distR="114300" simplePos="0" relativeHeight="251659264" behindDoc="0" locked="0" layoutInCell="1" allowOverlap="1" wp14:anchorId="5C4060AE" wp14:editId="5AE9AD92">
+          <wp:anchor distT="0" distB="0" distL="114300" distR="114300" simplePos="0" relativeHeight="251659264" behindDoc="0" locked="0" layoutInCell="1" allowOverlap="1" wp14:anchorId="5C4060AE" wp14:editId="64CEC040">
             <wp:simplePos x="0" y="0"/>
             <wp:positionH relativeFrom="margin">
               <wp:posOffset>5454650</wp:posOffset>
@@ -4846,6 +5051,7 @@
         </w:rPr>
       </w:pPr>
       <w:proofErr w:type="spellStart"/>
+      <w:proofErr w:type="gramStart"/>
       <w:r>
         <w:rPr>
           <w:rFonts w:ascii="Cascadia Mono" w:hAnsi="Cascadia Mono" w:cs="Cascadia Mono"/>
@@ -4853,7 +5059,17 @@
           <w:sz w:val="19"/>
           <w:szCs w:val="19"/>
         </w:rPr>
-        <w:t>asp-controller</w:t>
+        <w:t>asp</w:t>
+      </w:r>
+      <w:proofErr w:type="gramEnd"/>
+      <w:r>
+        <w:rPr>
+          <w:rFonts w:ascii="Cascadia Mono" w:hAnsi="Cascadia Mono" w:cs="Cascadia Mono"/>
+          <w:color w:val="FFE599" w:themeColor="accent4" w:themeTint="66"/>
+          <w:sz w:val="19"/>
+          <w:szCs w:val="19"/>
+        </w:rPr>
+        <w:t>-controller</w:t>
       </w:r>
       <w:proofErr w:type="spellEnd"/>
       <w:r>
@@ -5555,7 +5771,23 @@
           <w:b/>
           <w:bCs/>
         </w:rPr>
-        <w:t xml:space="preserve">="@("#Id" + </w:t>
+        <w:t>="</w:t>
+      </w:r>
+      <w:proofErr w:type="gramStart"/>
+      <w:r>
+        <w:rPr>
+          <w:b/>
+          <w:bCs/>
+        </w:rPr>
+        <w:t>@(</w:t>
+      </w:r>
+      <w:proofErr w:type="gramEnd"/>
+      <w:r>
+        <w:rPr>
+          <w:b/>
+          <w:bCs/>
+        </w:rPr>
+        <w:t xml:space="preserve">"#Id" + </w:t>
       </w:r>
       <w:proofErr w:type="spellStart"/>
       <w:r>
@@ -5581,7 +5813,23 @@
           <w:b/>
           <w:bCs/>
         </w:rPr>
-        <w:t xml:space="preserve">id="@("Id" + </w:t>
+        <w:t>id="</w:t>
+      </w:r>
+      <w:proofErr w:type="gramStart"/>
+      <w:r>
+        <w:rPr>
+          <w:b/>
+          <w:bCs/>
+        </w:rPr>
+        <w:t>@(</w:t>
+      </w:r>
+      <w:proofErr w:type="gramEnd"/>
+      <w:r>
+        <w:rPr>
+          <w:b/>
+          <w:bCs/>
+        </w:rPr>
+        <w:t xml:space="preserve">"Id" + </w:t>
       </w:r>
       <w:proofErr w:type="spellStart"/>
       <w:r>
@@ -5897,136 +6145,154 @@
         </w:rPr>
         <w:t xml:space="preserve">                    &lt;button class="accordion-button collapsed" type="button" data-bs-toggle="collapse" data-bs-target="</w:t>
       </w:r>
+      <w:proofErr w:type="gramStart"/>
       <w:r>
         <w:rPr>
           <w:sz w:val="18"/>
           <w:szCs w:val="18"/>
         </w:rPr>
-        <w:t xml:space="preserve">@("#Id" + </w:t>
-      </w:r>
-      <w:proofErr w:type="spellStart"/>
+        <w:t>@(</w:t>
+      </w:r>
+      <w:proofErr w:type="gramEnd"/>
       <w:r>
         <w:rPr>
           <w:sz w:val="18"/>
           <w:szCs w:val="18"/>
         </w:rPr>
-        <w:t>zombieType.Id</w:t>
-      </w:r>
-      <w:proofErr w:type="spellEnd"/>
+        <w:t xml:space="preserve">"#Id" + </w:t>
+      </w:r>
+      <w:proofErr w:type="spellStart"/>
       <w:r>
         <w:rPr>
           <w:sz w:val="18"/>
           <w:szCs w:val="18"/>
         </w:rPr>
-        <w:t>)</w:t>
-      </w:r>
+        <w:t>zombieType.Id</w:t>
+      </w:r>
+      <w:proofErr w:type="spellEnd"/>
       <w:r>
         <w:rPr>
           <w:sz w:val="18"/>
           <w:szCs w:val="18"/>
         </w:rPr>
-        <w:t>" aria-expanded="false" aria-controls="@</w:t>
-      </w:r>
-      <w:proofErr w:type="spellStart"/>
+        <w:t>)</w:t>
+      </w:r>
       <w:r>
         <w:rPr>
           <w:sz w:val="18"/>
           <w:szCs w:val="18"/>
         </w:rPr>
-        <w:t>zombieType.TypeName</w:t>
-      </w:r>
-      <w:proofErr w:type="spellEnd"/>
+        <w:t>" aria-expanded="false" aria-controls="@</w:t>
+      </w:r>
+      <w:proofErr w:type="spellStart"/>
       <w:r>
         <w:rPr>
           <w:sz w:val="18"/>
           <w:szCs w:val="18"/>
         </w:rPr>
-        <w:t>"&gt;</w:t>
-      </w:r>
-    </w:p>
-    <w:p>
-      <w:pPr>
-        <w:pStyle w:val="CodeInvisible"/>
+        <w:t>zombieType.TypeName</w:t>
+      </w:r>
+      <w:proofErr w:type="spellEnd"/>
+      <w:r>
         <w:rPr>
           <w:sz w:val="18"/>
           <w:szCs w:val="18"/>
         </w:rPr>
-      </w:pPr>
-      <w:r>
+        <w:t>"&gt;</w:t>
+      </w:r>
+    </w:p>
+    <w:p>
+      <w:pPr>
+        <w:pStyle w:val="CodeInvisible"/>
         <w:rPr>
           <w:sz w:val="18"/>
           <w:szCs w:val="18"/>
         </w:rPr>
-        <w:t xml:space="preserve">                        @zombieType.TypeName</w:t>
-      </w:r>
-    </w:p>
-    <w:p>
-      <w:pPr>
-        <w:pStyle w:val="CodeInvisible"/>
+      </w:pPr>
+      <w:r>
         <w:rPr>
           <w:sz w:val="18"/>
           <w:szCs w:val="18"/>
         </w:rPr>
-      </w:pPr>
-      <w:r>
+        <w:t xml:space="preserve">                        @zombieType.TypeName</w:t>
+      </w:r>
+    </w:p>
+    <w:p>
+      <w:pPr>
+        <w:pStyle w:val="CodeInvisible"/>
         <w:rPr>
           <w:sz w:val="18"/>
           <w:szCs w:val="18"/>
         </w:rPr>
-        <w:t xml:space="preserve">                    &lt;/button&gt;</w:t>
-      </w:r>
-    </w:p>
-    <w:p>
-      <w:pPr>
-        <w:pStyle w:val="CodeInvisible"/>
+      </w:pPr>
+      <w:r>
         <w:rPr>
           <w:sz w:val="18"/>
           <w:szCs w:val="18"/>
         </w:rPr>
-      </w:pPr>
-      <w:r>
+        <w:t xml:space="preserve">                    &lt;/button&gt;</w:t>
+      </w:r>
+    </w:p>
+    <w:p>
+      <w:pPr>
+        <w:pStyle w:val="CodeInvisible"/>
         <w:rPr>
           <w:sz w:val="18"/>
           <w:szCs w:val="18"/>
         </w:rPr>
-        <w:t xml:space="preserve">                &lt;/h2&gt;</w:t>
-      </w:r>
-    </w:p>
-    <w:p>
-      <w:pPr>
-        <w:pStyle w:val="CodeInvisible"/>
+      </w:pPr>
+      <w:r>
         <w:rPr>
           <w:sz w:val="18"/>
           <w:szCs w:val="18"/>
         </w:rPr>
-      </w:pPr>
-      <w:r>
+        <w:t xml:space="preserve">                &lt;/h2&gt;</w:t>
+      </w:r>
+    </w:p>
+    <w:p>
+      <w:pPr>
+        <w:pStyle w:val="CodeInvisible"/>
         <w:rPr>
           <w:sz w:val="18"/>
           <w:szCs w:val="18"/>
         </w:rPr>
-        <w:t xml:space="preserve">                &lt;div id</w:t>
-      </w:r>
+      </w:pPr>
       <w:r>
         <w:rPr>
           <w:sz w:val="18"/>
           <w:szCs w:val="18"/>
         </w:rPr>
-        <w:t>=</w:t>
+        <w:t xml:space="preserve">                &lt;div id</w:t>
       </w:r>
       <w:r>
         <w:rPr>
           <w:sz w:val="18"/>
           <w:szCs w:val="18"/>
         </w:rPr>
-        <w:t>"</w:t>
+        <w:t>=</w:t>
       </w:r>
       <w:r>
         <w:rPr>
           <w:sz w:val="18"/>
           <w:szCs w:val="18"/>
         </w:rPr>
-        <w:t xml:space="preserve">@("Id" + </w:t>
+        <w:t>"</w:t>
+      </w:r>
+      <w:proofErr w:type="gramStart"/>
+      <w:r>
+        <w:rPr>
+          <w:sz w:val="18"/>
+          <w:szCs w:val="18"/>
+        </w:rPr>
+        <w:t>@(</w:t>
+      </w:r>
+      <w:proofErr w:type="gramEnd"/>
+      <w:r>
+        <w:rPr>
+          <w:sz w:val="18"/>
+          <w:szCs w:val="18"/>
+        </w:rPr>
+        <w:t xml:space="preserve">"Id" + </w:t>
       </w:r>
       <w:proofErr w:type="spellStart"/>
       <w:r>
@@ -6196,23 +6462,23 @@
           <w:sz w:val="18"/>
           <w:szCs w:val="18"/>
         </w:rPr>
-        <w:t xml:space="preserve">="#" class="card  border m-3 text-center </w:t>
-      </w:r>
-      <w:proofErr w:type="spellStart"/>
+        <w:t>="#" class="</w:t>
+      </w:r>
+      <w:proofErr w:type="gramStart"/>
       <w:r>
         <w:rPr>
           <w:sz w:val="18"/>
           <w:szCs w:val="18"/>
         </w:rPr>
-        <w:t>bg</w:t>
-      </w:r>
-      <w:proofErr w:type="spellEnd"/>
+        <w:t>card  border</w:t>
+      </w:r>
+      <w:proofErr w:type="gramEnd"/>
       <w:r>
         <w:rPr>
           <w:sz w:val="18"/>
           <w:szCs w:val="18"/>
         </w:rPr>
-        <w:t xml:space="preserve">-warning" style="width: 20rem; background-image: </w:t>
+        <w:t xml:space="preserve"> m-3 text-center </w:t>
       </w:r>
       <w:proofErr w:type="spellStart"/>
       <w:r>
@@ -6220,7 +6486,7 @@
           <w:sz w:val="18"/>
           <w:szCs w:val="18"/>
         </w:rPr>
-        <w:t>url</w:t>
+        <w:t>bg</w:t>
       </w:r>
       <w:proofErr w:type="spellEnd"/>
       <w:r>
@@ -6228,7 +6494,7 @@
           <w:sz w:val="18"/>
           <w:szCs w:val="18"/>
         </w:rPr>
-        <w:t>('/images/</w:t>
+        <w:t xml:space="preserve">-warning" style="width: 20rem; background-image: </w:t>
       </w:r>
       <w:proofErr w:type="spellStart"/>
       <w:r>
@@ -6236,7 +6502,7 @@
           <w:sz w:val="18"/>
           <w:szCs w:val="18"/>
         </w:rPr>
-        <w:t>imagesLayout</w:t>
+        <w:t>url</w:t>
       </w:r>
       <w:proofErr w:type="spellEnd"/>
       <w:r>
@@ -6244,23 +6510,23 @@
           <w:sz w:val="18"/>
           <w:szCs w:val="18"/>
         </w:rPr>
-        <w:t>/Fond.png'); "&gt;</w:t>
-      </w:r>
-    </w:p>
-    <w:p>
-      <w:pPr>
-        <w:pStyle w:val="CodeInvisible"/>
+        <w:t>('/images/</w:t>
+      </w:r>
+      <w:proofErr w:type="spellStart"/>
+      <w:r>
         <w:rPr>
           <w:sz w:val="18"/>
           <w:szCs w:val="18"/>
         </w:rPr>
-      </w:pPr>
+        <w:t>imagesLayout</w:t>
+      </w:r>
+      <w:proofErr w:type="spellEnd"/>
       <w:r>
         <w:rPr>
           <w:sz w:val="18"/>
           <w:szCs w:val="18"/>
         </w:rPr>
-        <w:t xml:space="preserve">                                    &lt;div class="card-body  text-warning"&gt;</w:t>
+        <w:t>/Fond.png'); "&gt;</w:t>
       </w:r>
     </w:p>
     <w:p>
@@ -6276,23 +6542,23 @@
           <w:sz w:val="18"/>
           <w:szCs w:val="18"/>
         </w:rPr>
-        <w:t xml:space="preserve">                                        &lt;h3 class="card-title"&gt; @zombie.Name &lt;/h3&gt;</w:t>
-      </w:r>
-    </w:p>
-    <w:p>
-      <w:pPr>
-        <w:pStyle w:val="CodeInvisible"/>
+        <w:t xml:space="preserve">                                    &lt;div class="card-</w:t>
+      </w:r>
+      <w:proofErr w:type="gramStart"/>
+      <w:r>
         <w:rPr>
           <w:sz w:val="18"/>
           <w:szCs w:val="18"/>
         </w:rPr>
-      </w:pPr>
+        <w:t>body  text</w:t>
+      </w:r>
+      <w:proofErr w:type="gramEnd"/>
       <w:r>
         <w:rPr>
           <w:sz w:val="18"/>
           <w:szCs w:val="18"/>
         </w:rPr>
-        <w:t xml:space="preserve">                                        &lt;h5&gt; Points: @zombie.Point &lt;/h5&gt;</w:t>
+        <w:t>-warning"&gt;</w:t>
       </w:r>
     </w:p>
     <w:p>
@@ -6308,23 +6574,23 @@
           <w:sz w:val="18"/>
           <w:szCs w:val="18"/>
         </w:rPr>
-        <w:t xml:space="preserve">                                    &lt;/div&gt;</w:t>
-      </w:r>
-    </w:p>
-    <w:p>
-      <w:pPr>
-        <w:pStyle w:val="CodeInvisible"/>
+        <w:t xml:space="preserve">                                        &lt;h3 class="card-title"&gt; @</w:t>
+      </w:r>
+      <w:proofErr w:type="gramStart"/>
+      <w:r>
         <w:rPr>
           <w:sz w:val="18"/>
           <w:szCs w:val="18"/>
         </w:rPr>
-      </w:pPr>
+        <w:t>zombie.Name</w:t>
+      </w:r>
+      <w:proofErr w:type="gramEnd"/>
       <w:r>
         <w:rPr>
           <w:sz w:val="18"/>
           <w:szCs w:val="18"/>
         </w:rPr>
-        <w:t xml:space="preserve">                                &lt;/div&gt;</w:t>
+        <w:t xml:space="preserve"> &lt;/h3&gt;</w:t>
       </w:r>
     </w:p>
     <w:p>
@@ -6340,33 +6606,99 @@
           <w:sz w:val="18"/>
           <w:szCs w:val="18"/>
         </w:rPr>
-        <w:t xml:space="preserve">                            }</w:t>
-      </w:r>
-    </w:p>
-    <w:p>
-      <w:pPr>
-        <w:pStyle w:val="CodeInvisible"/>
+        <w:t xml:space="preserve">                                        &lt;h5&gt; Points: @</w:t>
+      </w:r>
+      <w:proofErr w:type="gramStart"/>
+      <w:r>
         <w:rPr>
           <w:sz w:val="18"/>
           <w:szCs w:val="18"/>
         </w:rPr>
-      </w:pPr>
+        <w:t>zombie.Point</w:t>
+      </w:r>
+      <w:proofErr w:type="gramEnd"/>
       <w:r>
         <w:rPr>
           <w:sz w:val="18"/>
           <w:szCs w:val="18"/>
         </w:rPr>
-        <w:t xml:space="preserve">                            @if (</w:t>
-      </w:r>
-      <w:proofErr w:type="spellStart"/>
-      <w:r>
+        <w:t xml:space="preserve"> &lt;/h5&gt;</w:t>
+      </w:r>
+    </w:p>
+    <w:p>
+      <w:pPr>
+        <w:pStyle w:val="CodeInvisible"/>
         <w:rPr>
           <w:sz w:val="18"/>
           <w:szCs w:val="18"/>
         </w:rPr>
+      </w:pPr>
+      <w:r>
+        <w:rPr>
+          <w:sz w:val="18"/>
+          <w:szCs w:val="18"/>
+        </w:rPr>
+        <w:t xml:space="preserve">                                    &lt;/div&gt;</w:t>
+      </w:r>
+    </w:p>
+    <w:p>
+      <w:pPr>
+        <w:pStyle w:val="CodeInvisible"/>
+        <w:rPr>
+          <w:sz w:val="18"/>
+          <w:szCs w:val="18"/>
+        </w:rPr>
+      </w:pPr>
+      <w:r>
+        <w:rPr>
+          <w:sz w:val="18"/>
+          <w:szCs w:val="18"/>
+        </w:rPr>
+        <w:t xml:space="preserve">                                &lt;/div&gt;</w:t>
+      </w:r>
+    </w:p>
+    <w:p>
+      <w:pPr>
+        <w:pStyle w:val="CodeInvisible"/>
+        <w:rPr>
+          <w:sz w:val="18"/>
+          <w:szCs w:val="18"/>
+        </w:rPr>
+      </w:pPr>
+      <w:r>
+        <w:rPr>
+          <w:sz w:val="18"/>
+          <w:szCs w:val="18"/>
+        </w:rPr>
+        <w:t xml:space="preserve">                            }</w:t>
+      </w:r>
+    </w:p>
+    <w:p>
+      <w:pPr>
+        <w:pStyle w:val="CodeInvisible"/>
+        <w:rPr>
+          <w:sz w:val="18"/>
+          <w:szCs w:val="18"/>
+        </w:rPr>
+      </w:pPr>
+      <w:r>
+        <w:rPr>
+          <w:sz w:val="18"/>
+          <w:szCs w:val="18"/>
+        </w:rPr>
+        <w:t xml:space="preserve">                            @if (</w:t>
+      </w:r>
+      <w:proofErr w:type="spellStart"/>
+      <w:proofErr w:type="gramStart"/>
+      <w:r>
+        <w:rPr>
+          <w:sz w:val="18"/>
+          <w:szCs w:val="18"/>
+        </w:rPr>
         <w:t>zombieType.Zombies.Count</w:t>
       </w:r>
       <w:proofErr w:type="spellEnd"/>
+      <w:proofErr w:type="gramEnd"/>
       <w:r>
         <w:rPr>
           <w:sz w:val="18"/>
@@ -6426,6 +6758,7 @@
         <w:t>&lt;</w:t>
       </w:r>
       <w:proofErr w:type="spellStart"/>
+      <w:proofErr w:type="gramStart"/>
       <w:r>
         <w:rPr>
           <w:sz w:val="18"/>
@@ -6435,6 +6768,7 @@
         <w:t>span</w:t>
       </w:r>
       <w:proofErr w:type="spellEnd"/>
+      <w:proofErr w:type="gramEnd"/>
       <w:r>
         <w:rPr>
           <w:sz w:val="18"/>
@@ -6967,6 +7301,7 @@
         <w:t xml:space="preserve">z </w:t>
       </w:r>
       <w:proofErr w:type="spellStart"/>
+      <w:proofErr w:type="gramStart"/>
       <w:r>
         <w:rPr>
           <w:b/>
@@ -6976,7 +7311,11 @@
       </w:r>
       <w:proofErr w:type="spellEnd"/>
       <w:r>
-        <w:t>()</w:t>
+        <w:t>(</w:t>
+      </w:r>
+      <w:proofErr w:type="gramEnd"/>
+      <w:r>
+        <w:t>)</w:t>
       </w:r>
     </w:p>
     <w:p>
@@ -7132,7 +7471,29 @@
           <w:szCs w:val="19"/>
           <w:lang w:val="en-CA"/>
         </w:rPr>
-        <w:t xml:space="preserve"> Index()</w:t>
+        <w:t xml:space="preserve"> </w:t>
+      </w:r>
+      <w:proofErr w:type="gramStart"/>
+      <w:r>
+        <w:rPr>
+          <w:rFonts w:ascii="Cascadia Mono" w:hAnsi="Cascadia Mono" w:cs="Cascadia Mono"/>
+          <w:color w:val="000000"/>
+          <w:sz w:val="19"/>
+          <w:szCs w:val="19"/>
+          <w:lang w:val="en-CA"/>
+        </w:rPr>
+        <w:t>Index(</w:t>
+      </w:r>
+      <w:proofErr w:type="gramEnd"/>
+      <w:r>
+        <w:rPr>
+          <w:rFonts w:ascii="Cascadia Mono" w:hAnsi="Cascadia Mono" w:cs="Cascadia Mono"/>
+          <w:color w:val="000000"/>
+          <w:sz w:val="19"/>
+          <w:szCs w:val="19"/>
+          <w:lang w:val="en-CA"/>
+        </w:rPr>
+        <w:t>)</w:t>
       </w:r>
     </w:p>
     <w:p>
@@ -7199,6 +7560,7 @@
         <w:t xml:space="preserve">    </w:t>
       </w:r>
       <w:proofErr w:type="spellStart"/>
+      <w:proofErr w:type="gramStart"/>
       <w:r>
         <w:rPr>
           <w:rFonts w:ascii="Cascadia Mono" w:hAnsi="Cascadia Mono" w:cs="Cascadia Mono"/>
@@ -7220,6 +7582,7 @@
         <w:t>.ViewBag.MaListe</w:t>
       </w:r>
       <w:proofErr w:type="spellEnd"/>
+      <w:proofErr w:type="gramEnd"/>
       <w:r>
         <w:rPr>
           <w:rFonts w:ascii="Cascadia Mono" w:hAnsi="Cascadia Mono" w:cs="Cascadia Mono"/>
@@ -7251,6 +7614,7 @@
         </w:rPr>
         <w:t xml:space="preserve"> </w:t>
       </w:r>
+      <w:proofErr w:type="gramStart"/>
       <w:r>
         <w:rPr>
           <w:rFonts w:ascii="Cascadia Mono" w:hAnsi="Cascadia Mono" w:cs="Cascadia Mono"/>
@@ -7316,6 +7680,7 @@
         <w:t>ToListAsync</w:t>
       </w:r>
       <w:proofErr w:type="spellEnd"/>
+      <w:proofErr w:type="gramEnd"/>
       <w:r>
         <w:rPr>
           <w:rFonts w:ascii="Cascadia Mono" w:hAnsi="Cascadia Mono" w:cs="Cascadia Mono"/>
@@ -7379,6 +7744,7 @@
         </w:rPr>
         <w:t xml:space="preserve">    </w:t>
       </w:r>
+      <w:proofErr w:type="gramStart"/>
       <w:r>
         <w:rPr>
           <w:rFonts w:ascii="Cascadia Mono" w:hAnsi="Cascadia Mono" w:cs="Cascadia Mono"/>
@@ -7388,14 +7754,35 @@
         </w:rPr>
         <w:t>return</w:t>
       </w:r>
-      <w:r>
-        <w:rPr>
-          <w:rFonts w:ascii="Cascadia Mono" w:hAnsi="Cascadia Mono" w:cs="Cascadia Mono"/>
-          <w:color w:val="000000"/>
-          <w:sz w:val="19"/>
-          <w:szCs w:val="19"/>
-        </w:rPr>
-        <w:t xml:space="preserve"> View();</w:t>
+      <w:proofErr w:type="gramEnd"/>
+      <w:r>
+        <w:rPr>
+          <w:rFonts w:ascii="Cascadia Mono" w:hAnsi="Cascadia Mono" w:cs="Cascadia Mono"/>
+          <w:color w:val="000000"/>
+          <w:sz w:val="19"/>
+          <w:szCs w:val="19"/>
+        </w:rPr>
+        <w:t xml:space="preserve"> </w:t>
+      </w:r>
+      <w:proofErr w:type="gramStart"/>
+      <w:r>
+        <w:rPr>
+          <w:rFonts w:ascii="Cascadia Mono" w:hAnsi="Cascadia Mono" w:cs="Cascadia Mono"/>
+          <w:color w:val="000000"/>
+          <w:sz w:val="19"/>
+          <w:szCs w:val="19"/>
+        </w:rPr>
+        <w:t>View(</w:t>
+      </w:r>
+      <w:proofErr w:type="gramEnd"/>
+      <w:r>
+        <w:rPr>
+          <w:rFonts w:ascii="Cascadia Mono" w:hAnsi="Cascadia Mono" w:cs="Cascadia Mono"/>
+          <w:color w:val="000000"/>
+          <w:sz w:val="19"/>
+          <w:szCs w:val="19"/>
+        </w:rPr>
+        <w:t>);</w:t>
       </w:r>
     </w:p>
     <w:p>
@@ -13457,10 +13844,6 @@
 </file>
 
 <file path=customXml/item1.xml><?xml version="1.0" encoding="utf-8"?>
-<b:Sources xmlns:b="http://schemas.openxmlformats.org/officeDocument/2006/bibliography" xmlns="http://schemas.openxmlformats.org/officeDocument/2006/bibliography" SelectedStyle="\APASixthEditionOfficeOnline.xsl" StyleName="APA" Version="6"/>
-</file>
-
-<file path=customXml/item2.xml><?xml version="1.0" encoding="utf-8"?>
 <ct:contentTypeSchema xmlns:ct="http://schemas.microsoft.com/office/2006/metadata/contentType" xmlns:ma="http://schemas.microsoft.com/office/2006/metadata/properties/metaAttributes" ct:_="" ma:_="" ma:contentTypeName="Document" ma:contentTypeID="0x010100354AEAE9FD62D747A26A546E5B1B5735" ma:contentTypeVersion="7" ma:contentTypeDescription="Crée un document." ma:contentTypeScope="" ma:versionID="43b763fe9aa20b7a2976a5e019d82dbf">
   <xsd:schema xmlns:xsd="http://www.w3.org/2001/XMLSchema" xmlns:xs="http://www.w3.org/2001/XMLSchema" xmlns:p="http://schemas.microsoft.com/office/2006/metadata/properties" xmlns:ns2="071933db-0376-4694-9786-b56cb37c4ec2" targetNamespace="http://schemas.microsoft.com/office/2006/metadata/properties" ma:root="true" ma:fieldsID="d5c90ae6c1ec6ed317c9f5feddaf7a33" ns2:_="">
     <xsd:import namespace="071933db-0376-4694-9786-b56cb37c4ec2"/>
@@ -13624,13 +14007,11 @@
 </ct:contentTypeSchema>
 </file>
 
-<file path=customXml/item3.xml><?xml version="1.0" encoding="utf-8"?>
-<p:properties xmlns:p="http://schemas.microsoft.com/office/2006/metadata/properties" xmlns:xsi="http://www.w3.org/2001/XMLSchema-instance" xmlns:pc="http://schemas.microsoft.com/office/infopath/2007/PartnerControls">
-  <documentManagement/>
-</p:properties>
+<file path=customXml/item2.xml><?xml version="1.0" encoding="utf-8"?>
+<b:Sources xmlns:b="http://schemas.openxmlformats.org/officeDocument/2006/bibliography" xmlns="http://schemas.openxmlformats.org/officeDocument/2006/bibliography" SelectedStyle="\APASixthEditionOfficeOnline.xsl" StyleName="APA" Version="6"/>
 </file>
 
-<file path=customXml/item4.xml><?xml version="1.0" encoding="utf-8"?>
+<file path=customXml/item3.xml><?xml version="1.0" encoding="utf-8"?>
 <?mso-contentType ?>
 <FormTemplates xmlns="http://schemas.microsoft.com/sharepoint/v3/contenttype/forms">
   <Display>DocumentLibraryForm</Display>
@@ -13639,15 +14020,13 @@
 </FormTemplates>
 </file>
 
-<file path=customXml/itemProps1.xml><?xml version="1.0" encoding="utf-8"?>
-<ds:datastoreItem xmlns:ds="http://schemas.openxmlformats.org/officeDocument/2006/customXml" ds:itemID="{28D15B86-D92D-420E-A893-C7613CFD01AE}">
-  <ds:schemaRefs>
-    <ds:schemaRef ds:uri="http://schemas.openxmlformats.org/officeDocument/2006/bibliography"/>
-  </ds:schemaRefs>
-</ds:datastoreItem>
+<file path=customXml/item4.xml><?xml version="1.0" encoding="utf-8"?>
+<p:properties xmlns:p="http://schemas.microsoft.com/office/2006/metadata/properties" xmlns:xsi="http://www.w3.org/2001/XMLSchema-instance" xmlns:pc="http://schemas.microsoft.com/office/infopath/2007/PartnerControls">
+  <documentManagement/>
+</p:properties>
 </file>
 
-<file path=customXml/itemProps2.xml><?xml version="1.0" encoding="utf-8"?>
+<file path=customXml/itemProps1.xml><?xml version="1.0" encoding="utf-8"?>
 <ds:datastoreItem xmlns:ds="http://schemas.openxmlformats.org/officeDocument/2006/customXml" ds:itemID="{5C3A06EC-DC03-4D65-AA15-C6B9D68C1ED0}">
   <ds:schemaRefs>
     <ds:schemaRef ds:uri="http://schemas.microsoft.com/office/2006/metadata/contentType"/>
@@ -13665,19 +14044,27 @@
 </ds:datastoreItem>
 </file>
 
+<file path=customXml/itemProps2.xml><?xml version="1.0" encoding="utf-8"?>
+<ds:datastoreItem xmlns:ds="http://schemas.openxmlformats.org/officeDocument/2006/customXml" ds:itemID="{28D15B86-D92D-420E-A893-C7613CFD01AE}">
+  <ds:schemaRefs>
+    <ds:schemaRef ds:uri="http://schemas.openxmlformats.org/officeDocument/2006/bibliography"/>
+  </ds:schemaRefs>
+</ds:datastoreItem>
+</file>
+
 <file path=customXml/itemProps3.xml><?xml version="1.0" encoding="utf-8"?>
+<ds:datastoreItem xmlns:ds="http://schemas.openxmlformats.org/officeDocument/2006/customXml" ds:itemID="{F6194C16-5FE5-4670-BEC8-3D6DD9380312}">
+  <ds:schemaRefs>
+    <ds:schemaRef ds:uri="http://schemas.microsoft.com/sharepoint/v3/contenttype/forms"/>
+  </ds:schemaRefs>
+</ds:datastoreItem>
+</file>
+
+<file path=customXml/itemProps4.xml><?xml version="1.0" encoding="utf-8"?>
 <ds:datastoreItem xmlns:ds="http://schemas.openxmlformats.org/officeDocument/2006/customXml" ds:itemID="{2C36E056-BA2C-4A1F-9580-242C9B36FE70}">
   <ds:schemaRefs>
     <ds:schemaRef ds:uri="http://schemas.microsoft.com/office/2006/metadata/properties"/>
     <ds:schemaRef ds:uri="http://schemas.microsoft.com/office/infopath/2007/PartnerControls"/>
   </ds:schemaRefs>
 </ds:datastoreItem>
-</file>
-
-<file path=customXml/itemProps4.xml><?xml version="1.0" encoding="utf-8"?>
-<ds:datastoreItem xmlns:ds="http://schemas.openxmlformats.org/officeDocument/2006/customXml" ds:itemID="{F6194C16-5FE5-4670-BEC8-3D6DD9380312}">
-  <ds:schemaRefs>
-    <ds:schemaRef ds:uri="http://schemas.microsoft.com/sharepoint/v3/contenttype/forms"/>
-  </ds:schemaRefs>
-</ds:datastoreItem>
 </file>
</xml_diff>